<commit_message>
Updated Flask API file doc
</commit_message>
<xml_diff>
--- a/tute_Flask_Mongodb.docx
+++ b/tute_Flask_Mongodb.docx
@@ -4,20 +4,15 @@
   <w:body>
     <w:p>
       <w:r>
-        <w:t>1. Create a Flask application with an /</w:t>
-      </w:r>
-      <w:proofErr w:type="spellStart"/>
-      <w:r>
-        <w:t>api</w:t>
-      </w:r>
-      <w:proofErr w:type="spellEnd"/>
-      <w:r>
-        <w:t xml:space="preserve"> route. When this route is accessed, it should return a JSON list. The data should be stored in a backend file, read from it, and sent as a response.</w:t>
+        <w:t>1. Create a Flask application with an /api route. When this route is accessed, it should return a JSON list. The data should be stored in a backend file, read from it, and sent as a response.</w:t>
       </w:r>
     </w:p>
     <w:p/>
     <w:p>
       <w:r>
+        <w:rPr>
+          <w:noProof/>
+        </w:rPr>
         <w:drawing>
           <wp:inline distT="0" distB="0" distL="0" distR="0" wp14:anchorId="277FE32B" wp14:editId="43609A7F">
             <wp:extent cx="5731510" cy="1505585"/>
@@ -57,6 +52,9 @@
     </w:p>
     <w:p>
       <w:r>
+        <w:rPr>
+          <w:noProof/>
+        </w:rPr>
         <w:drawing>
           <wp:inline distT="0" distB="0" distL="0" distR="0" wp14:anchorId="25BF4044" wp14:editId="3D1473EA">
             <wp:extent cx="5731510" cy="4562475"/>
@@ -97,33 +95,18 @@
     <w:p/>
     <w:p>
       <w:r>
-        <w:t xml:space="preserve">from flask import Flask, </w:t>
-      </w:r>
-      <w:proofErr w:type="spellStart"/>
-      <w:r>
-        <w:t>jsonify</w:t>
-      </w:r>
-      <w:proofErr w:type="spellEnd"/>
-    </w:p>
-    <w:p>
-      <w:r>
-        <w:t xml:space="preserve">import </w:t>
-      </w:r>
-      <w:proofErr w:type="spellStart"/>
-      <w:r>
-        <w:t>json</w:t>
-      </w:r>
-      <w:proofErr w:type="spellEnd"/>
-    </w:p>
-    <w:p>
-      <w:r>
-        <w:t xml:space="preserve">import </w:t>
-      </w:r>
-      <w:proofErr w:type="spellStart"/>
-      <w:r>
-        <w:t>os</w:t>
-      </w:r>
-      <w:proofErr w:type="spellEnd"/>
+        <w:t>from flask import Flask, jsonify</w:t>
+      </w:r>
+    </w:p>
+    <w:p>
+      <w:r>
+        <w:t>import json</w:t>
+      </w:r>
+    </w:p>
+    <w:p>
+      <w:r>
+        <w:t>import os</w:t>
+      </w:r>
     </w:p>
     <w:p/>
     <w:p>
@@ -133,77 +116,25 @@
       </w:r>
     </w:p>
     <w:p>
-      <w:proofErr w:type="spellStart"/>
-      <w:r>
-        <w:t>app.config</w:t>
-      </w:r>
-      <w:proofErr w:type="spellEnd"/>
-      <w:r>
-        <w:t>['JSONIFY_PRETTYPRINT_REGULAR'] = True</w:t>
+      <w:r>
+        <w:t>app.config['JSONIFY_PRETTYPRINT_REGULAR'] = True</w:t>
       </w:r>
     </w:p>
     <w:p/>
     <w:p>
       <w:r>
-        <w:t>DATA_FILE = '</w:t>
-      </w:r>
-      <w:proofErr w:type="spellStart"/>
-      <w:proofErr w:type="gramStart"/>
-      <w:r>
-        <w:t>data.json</w:t>
-      </w:r>
-      <w:proofErr w:type="spellEnd"/>
-      <w:proofErr w:type="gramEnd"/>
-      <w:r>
-        <w:t>'</w:t>
+        <w:t>DATA_FILE = 'data.json'</w:t>
       </w:r>
     </w:p>
     <w:p/>
     <w:p>
       <w:r>
-        <w:t xml:space="preserve">def </w:t>
-      </w:r>
-      <w:proofErr w:type="spellStart"/>
-      <w:r>
-        <w:t>read_</w:t>
-      </w:r>
-      <w:proofErr w:type="gramStart"/>
-      <w:r>
-        <w:t>data</w:t>
-      </w:r>
-      <w:proofErr w:type="spellEnd"/>
-      <w:r>
-        <w:t>(</w:t>
-      </w:r>
-      <w:proofErr w:type="gramEnd"/>
-      <w:r>
-        <w:t>):</w:t>
-      </w:r>
-    </w:p>
-    <w:p>
-      <w:r>
-        <w:t xml:space="preserve">    if not </w:t>
-      </w:r>
-      <w:proofErr w:type="spellStart"/>
-      <w:proofErr w:type="gramStart"/>
-      <w:r>
-        <w:t>os.path</w:t>
-      </w:r>
-      <w:proofErr w:type="gramEnd"/>
-      <w:r>
-        <w:t>.</w:t>
-      </w:r>
-      <w:proofErr w:type="gramStart"/>
-      <w:r>
-        <w:t>exists</w:t>
-      </w:r>
-      <w:proofErr w:type="spellEnd"/>
-      <w:r>
-        <w:t>(</w:t>
-      </w:r>
-      <w:proofErr w:type="gramEnd"/>
-      <w:r>
-        <w:t>DATA_FILE):</w:t>
+        <w:t>def read_data():</w:t>
+      </w:r>
+    </w:p>
+    <w:p>
+      <w:r>
+        <w:t>    if not os.path.exists(DATA_FILE):</w:t>
       </w:r>
     </w:p>
     <w:p>
@@ -214,15 +145,7 @@
     <w:p/>
     <w:p>
       <w:r>
-        <w:t xml:space="preserve">    with </w:t>
-      </w:r>
-      <w:proofErr w:type="gramStart"/>
-      <w:r>
-        <w:t>open(</w:t>
-      </w:r>
-      <w:proofErr w:type="gramEnd"/>
-      <w:r>
-        <w:t>DATA_FILE, 'r') as file:</w:t>
+        <w:t>    with open(DATA_FILE, 'r') as file:</w:t>
       </w:r>
     </w:p>
     <w:p>
@@ -232,32 +155,12 @@
     </w:p>
     <w:p>
       <w:r>
-        <w:t xml:space="preserve">            data = </w:t>
-      </w:r>
-      <w:proofErr w:type="spellStart"/>
-      <w:proofErr w:type="gramStart"/>
-      <w:r>
-        <w:t>json.load</w:t>
-      </w:r>
-      <w:proofErr w:type="spellEnd"/>
-      <w:proofErr w:type="gramEnd"/>
-      <w:r>
-        <w:t>(file)</w:t>
-      </w:r>
-    </w:p>
-    <w:p>
-      <w:r>
-        <w:t xml:space="preserve">        except </w:t>
-      </w:r>
-      <w:proofErr w:type="spellStart"/>
-      <w:proofErr w:type="gramStart"/>
-      <w:r>
-        <w:t>json.JSONDecodeError</w:t>
-      </w:r>
-      <w:proofErr w:type="spellEnd"/>
-      <w:proofErr w:type="gramEnd"/>
-      <w:r>
-        <w:t>:</w:t>
+        <w:t>            data = json.load(file)</w:t>
+      </w:r>
+    </w:p>
+    <w:p>
+      <w:r>
+        <w:t>        except json.JSONDecodeError:</w:t>
       </w:r>
     </w:p>
     <w:p>
@@ -273,97 +176,33 @@
     <w:p/>
     <w:p>
       <w:r>
-        <w:t>@</w:t>
-      </w:r>
-      <w:proofErr w:type="gramStart"/>
-      <w:r>
-        <w:t>app.route</w:t>
-      </w:r>
-      <w:proofErr w:type="gramEnd"/>
-      <w:r>
-        <w:t>('/api', methods=['GET'])</w:t>
-      </w:r>
-    </w:p>
-    <w:p>
-      <w:r>
-        <w:t xml:space="preserve">def </w:t>
-      </w:r>
-      <w:proofErr w:type="spellStart"/>
-      <w:r>
-        <w:t>get_</w:t>
-      </w:r>
-      <w:proofErr w:type="gramStart"/>
-      <w:r>
-        <w:t>data</w:t>
-      </w:r>
-      <w:proofErr w:type="spellEnd"/>
-      <w:r>
-        <w:t>(</w:t>
-      </w:r>
-      <w:proofErr w:type="gramEnd"/>
-      <w:r>
-        <w:t>):</w:t>
-      </w:r>
-    </w:p>
-    <w:p>
-      <w:r>
-        <w:t xml:space="preserve">    data = </w:t>
-      </w:r>
-      <w:proofErr w:type="spellStart"/>
-      <w:r>
-        <w:t>read_</w:t>
-      </w:r>
-      <w:proofErr w:type="gramStart"/>
-      <w:r>
-        <w:t>data</w:t>
-      </w:r>
-      <w:proofErr w:type="spellEnd"/>
-      <w:r>
-        <w:t>(</w:t>
-      </w:r>
-      <w:proofErr w:type="gramEnd"/>
-      <w:r>
-        <w:t>)</w:t>
-      </w:r>
-    </w:p>
-    <w:p>
-      <w:r>
-        <w:t xml:space="preserve">    return </w:t>
-      </w:r>
-      <w:proofErr w:type="spellStart"/>
-      <w:r>
-        <w:t>jsonify</w:t>
-      </w:r>
-      <w:proofErr w:type="spellEnd"/>
-      <w:r>
-        <w:t>(data), 200</w:t>
+        <w:t>@app.route('/api', methods=['GET'])</w:t>
+      </w:r>
+    </w:p>
+    <w:p>
+      <w:r>
+        <w:t>def get_data():</w:t>
+      </w:r>
+    </w:p>
+    <w:p>
+      <w:r>
+        <w:t>    data = read_data()</w:t>
+      </w:r>
+    </w:p>
+    <w:p>
+      <w:r>
+        <w:t>    return jsonify(data), 200</w:t>
       </w:r>
     </w:p>
     <w:p/>
     <w:p>
       <w:r>
-        <w:t>@</w:t>
-      </w:r>
-      <w:proofErr w:type="gramStart"/>
-      <w:r>
-        <w:t>app.route</w:t>
-      </w:r>
-      <w:proofErr w:type="gramEnd"/>
-      <w:r>
-        <w:t>('/')</w:t>
-      </w:r>
-    </w:p>
-    <w:p>
-      <w:r>
-        <w:t xml:space="preserve">def </w:t>
-      </w:r>
-      <w:proofErr w:type="gramStart"/>
-      <w:r>
-        <w:t>home(</w:t>
-      </w:r>
-      <w:proofErr w:type="gramEnd"/>
-      <w:r>
-        <w:t>):</w:t>
+        <w:t>@app.route('/')</w:t>
+      </w:r>
+    </w:p>
+    <w:p>
+      <w:r>
+        <w:t>def home():</w:t>
       </w:r>
     </w:p>
     <w:p>
@@ -378,19 +217,14 @@
     </w:p>
     <w:p>
       <w:r>
-        <w:t xml:space="preserve">    </w:t>
-      </w:r>
-      <w:proofErr w:type="spellStart"/>
-      <w:r>
-        <w:t>app.run</w:t>
-      </w:r>
-      <w:proofErr w:type="spellEnd"/>
-      <w:r>
-        <w:t>(debug=True)</w:t>
-      </w:r>
-    </w:p>
-    <w:p>
-      <w:r>
+        <w:t>    app.run(debug=True)</w:t>
+      </w:r>
+    </w:p>
+    <w:p>
+      <w:r>
+        <w:rPr>
+          <w:noProof/>
+        </w:rPr>
         <w:lastRenderedPageBreak/>
         <w:drawing>
           <wp:inline distT="0" distB="0" distL="0" distR="0" wp14:anchorId="16687370" wp14:editId="2B9F73ED">
@@ -486,7 +320,15 @@
       </w:r>
     </w:p>
     <w:p>
-      <w:r>
+      <w:pPr>
+        <w:rPr>
+          <w:noProof/>
+        </w:rPr>
+      </w:pPr>
+      <w:r>
+        <w:rPr>
+          <w:noProof/>
+        </w:rPr>
         <w:drawing>
           <wp:inline distT="0" distB="0" distL="0" distR="0" wp14:anchorId="7A076867" wp14:editId="093D1F33">
             <wp:extent cx="3071126" cy="4130398"/>
@@ -512,6 +354,491 @@
                     <a:xfrm>
                       <a:off x="0" y="0"/>
                       <a:ext cx="3071126" cy="4130398"/>
+                    </a:xfrm>
+                    <a:prstGeom prst="rect">
+                      <a:avLst/>
+                    </a:prstGeom>
+                  </pic:spPr>
+                </pic:pic>
+              </a:graphicData>
+            </a:graphic>
+          </wp:inline>
+        </w:drawing>
+      </w:r>
+    </w:p>
+    <w:p/>
+    <w:p>
+      <w:r>
+        <w:lastRenderedPageBreak/>
+        <w:t xml:space="preserve">2. Create a form on the frontend that, when submitted, inserts data into MongoDB Atlas. Upon successful submission, the user should be redirected to another page displaying the message </w:t>
+      </w:r>
+      <w:r>
+        <w:rPr>
+          <w:b/>
+          <w:bCs/>
+        </w:rPr>
+        <w:t>"Data submitted successfully"</w:t>
+      </w:r>
+      <w:r>
+        <w:t>. If there's an error during submission, display the error on the same page without redirection.</w:t>
+      </w:r>
+    </w:p>
+    <w:p>
+      <w:r>
+        <w:drawing>
+          <wp:inline distT="0" distB="0" distL="0" distR="0" wp14:anchorId="2012CAAC" wp14:editId="5343A575">
+            <wp:extent cx="5731510" cy="2843530"/>
+            <wp:effectExtent l="0" t="0" r="2540" b="0"/>
+            <wp:docPr id="1000103231" name="Picture 1"/>
+            <wp:cNvGraphicFramePr>
+              <a:graphicFrameLocks xmlns:a="http://schemas.openxmlformats.org/drawingml/2006/main" noChangeAspect="1"/>
+            </wp:cNvGraphicFramePr>
+            <a:graphic xmlns:a="http://schemas.openxmlformats.org/drawingml/2006/main">
+              <a:graphicData uri="http://schemas.openxmlformats.org/drawingml/2006/picture">
+                <pic:pic xmlns:pic="http://schemas.openxmlformats.org/drawingml/2006/picture">
+                  <pic:nvPicPr>
+                    <pic:cNvPr id="1000103231" name=""/>
+                    <pic:cNvPicPr/>
+                  </pic:nvPicPr>
+                  <pic:blipFill>
+                    <a:blip r:embed="rId9"/>
+                    <a:stretch>
+                      <a:fillRect/>
+                    </a:stretch>
+                  </pic:blipFill>
+                  <pic:spPr>
+                    <a:xfrm>
+                      <a:off x="0" y="0"/>
+                      <a:ext cx="5731510" cy="2843530"/>
+                    </a:xfrm>
+                    <a:prstGeom prst="rect">
+                      <a:avLst/>
+                    </a:prstGeom>
+                  </pic:spPr>
+                </pic:pic>
+              </a:graphicData>
+            </a:graphic>
+          </wp:inline>
+        </w:drawing>
+      </w:r>
+    </w:p>
+    <w:p>
+      <w:r>
+        <w:drawing>
+          <wp:inline distT="0" distB="0" distL="0" distR="0" wp14:anchorId="4C14AFA1" wp14:editId="4CEFA566">
+            <wp:extent cx="5731510" cy="3200400"/>
+            <wp:effectExtent l="0" t="0" r="2540" b="0"/>
+            <wp:docPr id="993921566" name="Picture 1"/>
+            <wp:cNvGraphicFramePr>
+              <a:graphicFrameLocks xmlns:a="http://schemas.openxmlformats.org/drawingml/2006/main" noChangeAspect="1"/>
+            </wp:cNvGraphicFramePr>
+            <a:graphic xmlns:a="http://schemas.openxmlformats.org/drawingml/2006/main">
+              <a:graphicData uri="http://schemas.openxmlformats.org/drawingml/2006/picture">
+                <pic:pic xmlns:pic="http://schemas.openxmlformats.org/drawingml/2006/picture">
+                  <pic:nvPicPr>
+                    <pic:cNvPr id="993921566" name=""/>
+                    <pic:cNvPicPr/>
+                  </pic:nvPicPr>
+                  <pic:blipFill>
+                    <a:blip r:embed="rId10"/>
+                    <a:stretch>
+                      <a:fillRect/>
+                    </a:stretch>
+                  </pic:blipFill>
+                  <pic:spPr>
+                    <a:xfrm>
+                      <a:off x="0" y="0"/>
+                      <a:ext cx="5731510" cy="3200400"/>
+                    </a:xfrm>
+                    <a:prstGeom prst="rect">
+                      <a:avLst/>
+                    </a:prstGeom>
+                  </pic:spPr>
+                </pic:pic>
+              </a:graphicData>
+            </a:graphic>
+          </wp:inline>
+        </w:drawing>
+      </w:r>
+    </w:p>
+    <w:p>
+      <w:r>
+        <w:t>from flask import Flask, request, redirect, url_for, render_template</w:t>
+      </w:r>
+    </w:p>
+    <w:p>
+      <w:r>
+        <w:t>from pymongo import MongoClient</w:t>
+      </w:r>
+    </w:p>
+    <w:p/>
+    <w:p>
+      <w:r>
+        <w:t>app = Flask(__name__)</w:t>
+      </w:r>
+    </w:p>
+    <w:p/>
+    <w:p>
+      <w:r>
+        <w:lastRenderedPageBreak/>
+        <w:t>MONGO_URI = "mongodb+srv://gautamshilpaprakash_db_user:</w:t>
+      </w:r>
+      <w:r>
+        <w:t>#########</w:t>
+      </w:r>
+      <w:r>
+        <w:t>@cluster0.6uxerhs.mongodb.net/testdb?retryWrites=true&amp;w=majority"</w:t>
+      </w:r>
+    </w:p>
+    <w:p>
+      <w:r>
+        <w:t>client = MongoClient(MONGO_URI)</w:t>
+      </w:r>
+    </w:p>
+    <w:p>
+      <w:r>
+        <w:t>db = client["testdb"]</w:t>
+      </w:r>
+    </w:p>
+    <w:p>
+      <w:r>
+        <w:t>collection = db["users"]</w:t>
+      </w:r>
+    </w:p>
+    <w:p/>
+    <w:p>
+      <w:r>
+        <w:t>@app.route('/')</w:t>
+      </w:r>
+    </w:p>
+    <w:p>
+      <w:r>
+        <w:t>def form():</w:t>
+      </w:r>
+    </w:p>
+    <w:p>
+      <w:r>
+        <w:t>    return render_template("form.html")</w:t>
+      </w:r>
+    </w:p>
+    <w:p/>
+    <w:p>
+      <w:r>
+        <w:t>@app.route('/submit', methods=['POST'])</w:t>
+      </w:r>
+    </w:p>
+    <w:p>
+      <w:r>
+        <w:t>def submit():</w:t>
+      </w:r>
+    </w:p>
+    <w:p>
+      <w:r>
+        <w:t>    try:</w:t>
+      </w:r>
+    </w:p>
+    <w:p>
+      <w:r>
+        <w:t>        data = {</w:t>
+      </w:r>
+    </w:p>
+    <w:p>
+      <w:r>
+        <w:t>            "name": request.form.get("name"),</w:t>
+      </w:r>
+    </w:p>
+    <w:p>
+      <w:r>
+        <w:t>            "email": request.form.get("email")</w:t>
+      </w:r>
+    </w:p>
+    <w:p>
+      <w:r>
+        <w:t>        }</w:t>
+      </w:r>
+    </w:p>
+    <w:p/>
+    <w:p>
+      <w:r>
+        <w:t>        collection.insert_one(data)</w:t>
+      </w:r>
+    </w:p>
+    <w:p/>
+    <w:p>
+      <w:r>
+        <w:t>        return redirect(url_for('success'))</w:t>
+      </w:r>
+    </w:p>
+    <w:p/>
+    <w:p>
+      <w:r>
+        <w:t>    except Exception as e:</w:t>
+      </w:r>
+    </w:p>
+    <w:p>
+      <w:r>
+        <w:t>       </w:t>
+      </w:r>
+    </w:p>
+    <w:p>
+      <w:r>
+        <w:t>        return render_template("form.html", error=str(e))</w:t>
+      </w:r>
+    </w:p>
+    <w:p/>
+    <w:p>
+      <w:r>
+        <w:t>@app.route('/success')</w:t>
+      </w:r>
+    </w:p>
+    <w:p>
+      <w:r>
+        <w:t>def success():</w:t>
+      </w:r>
+    </w:p>
+    <w:p>
+      <w:r>
+        <w:lastRenderedPageBreak/>
+        <w:t>    return "Data submitted successfully"</w:t>
+      </w:r>
+    </w:p>
+    <w:p/>
+    <w:p>
+      <w:r>
+        <w:t>if __name__ == '__main__':</w:t>
+      </w:r>
+    </w:p>
+    <w:p>
+      <w:r>
+        <w:t>    app.run(debug=True)</w:t>
+      </w:r>
+    </w:p>
+    <w:p/>
+    <w:p>
+      <w:r>
+        <w:drawing>
+          <wp:inline distT="0" distB="0" distL="0" distR="0" wp14:anchorId="7E6A1371" wp14:editId="4678E04B">
+            <wp:extent cx="4473328" cy="3360711"/>
+            <wp:effectExtent l="0" t="0" r="3810" b="0"/>
+            <wp:docPr id="1052062681" name="Picture 1"/>
+            <wp:cNvGraphicFramePr>
+              <a:graphicFrameLocks xmlns:a="http://schemas.openxmlformats.org/drawingml/2006/main" noChangeAspect="1"/>
+            </wp:cNvGraphicFramePr>
+            <a:graphic xmlns:a="http://schemas.openxmlformats.org/drawingml/2006/main">
+              <a:graphicData uri="http://schemas.openxmlformats.org/drawingml/2006/picture">
+                <pic:pic xmlns:pic="http://schemas.openxmlformats.org/drawingml/2006/picture">
+                  <pic:nvPicPr>
+                    <pic:cNvPr id="1052062681" name=""/>
+                    <pic:cNvPicPr/>
+                  </pic:nvPicPr>
+                  <pic:blipFill>
+                    <a:blip r:embed="rId11"/>
+                    <a:stretch>
+                      <a:fillRect/>
+                    </a:stretch>
+                  </pic:blipFill>
+                  <pic:spPr>
+                    <a:xfrm>
+                      <a:off x="0" y="0"/>
+                      <a:ext cx="4473328" cy="3360711"/>
+                    </a:xfrm>
+                    <a:prstGeom prst="rect">
+                      <a:avLst/>
+                    </a:prstGeom>
+                  </pic:spPr>
+                </pic:pic>
+              </a:graphicData>
+            </a:graphic>
+          </wp:inline>
+        </w:drawing>
+      </w:r>
+    </w:p>
+    <w:p>
+      <w:r>
+        <w:drawing>
+          <wp:inline distT="0" distB="0" distL="0" distR="0" wp14:anchorId="1F0673D3" wp14:editId="7C9FAA40">
+            <wp:extent cx="5731510" cy="2388235"/>
+            <wp:effectExtent l="0" t="0" r="2540" b="0"/>
+            <wp:docPr id="827452712" name="Picture 1"/>
+            <wp:cNvGraphicFramePr>
+              <a:graphicFrameLocks xmlns:a="http://schemas.openxmlformats.org/drawingml/2006/main" noChangeAspect="1"/>
+            </wp:cNvGraphicFramePr>
+            <a:graphic xmlns:a="http://schemas.openxmlformats.org/drawingml/2006/main">
+              <a:graphicData uri="http://schemas.openxmlformats.org/drawingml/2006/picture">
+                <pic:pic xmlns:pic="http://schemas.openxmlformats.org/drawingml/2006/picture">
+                  <pic:nvPicPr>
+                    <pic:cNvPr id="827452712" name=""/>
+                    <pic:cNvPicPr/>
+                  </pic:nvPicPr>
+                  <pic:blipFill>
+                    <a:blip r:embed="rId12"/>
+                    <a:stretch>
+                      <a:fillRect/>
+                    </a:stretch>
+                  </pic:blipFill>
+                  <pic:spPr>
+                    <a:xfrm>
+                      <a:off x="0" y="0"/>
+                      <a:ext cx="5731510" cy="2388235"/>
+                    </a:xfrm>
+                    <a:prstGeom prst="rect">
+                      <a:avLst/>
+                    </a:prstGeom>
+                  </pic:spPr>
+                </pic:pic>
+              </a:graphicData>
+            </a:graphic>
+          </wp:inline>
+        </w:drawing>
+      </w:r>
+    </w:p>
+    <w:p/>
+    <w:p>
+      <w:r>
+        <w:lastRenderedPageBreak/>
+        <w:drawing>
+          <wp:inline distT="0" distB="0" distL="0" distR="0" wp14:anchorId="32A8B2EE" wp14:editId="0CE535DF">
+            <wp:extent cx="4465707" cy="2751058"/>
+            <wp:effectExtent l="0" t="0" r="0" b="0"/>
+            <wp:docPr id="790279708" name="Picture 1"/>
+            <wp:cNvGraphicFramePr>
+              <a:graphicFrameLocks xmlns:a="http://schemas.openxmlformats.org/drawingml/2006/main" noChangeAspect="1"/>
+            </wp:cNvGraphicFramePr>
+            <a:graphic xmlns:a="http://schemas.openxmlformats.org/drawingml/2006/main">
+              <a:graphicData uri="http://schemas.openxmlformats.org/drawingml/2006/picture">
+                <pic:pic xmlns:pic="http://schemas.openxmlformats.org/drawingml/2006/picture">
+                  <pic:nvPicPr>
+                    <pic:cNvPr id="790279708" name=""/>
+                    <pic:cNvPicPr/>
+                  </pic:nvPicPr>
+                  <pic:blipFill>
+                    <a:blip r:embed="rId13"/>
+                    <a:stretch>
+                      <a:fillRect/>
+                    </a:stretch>
+                  </pic:blipFill>
+                  <pic:spPr>
+                    <a:xfrm>
+                      <a:off x="0" y="0"/>
+                      <a:ext cx="4465707" cy="2751058"/>
+                    </a:xfrm>
+                    <a:prstGeom prst="rect">
+                      <a:avLst/>
+                    </a:prstGeom>
+                  </pic:spPr>
+                </pic:pic>
+              </a:graphicData>
+            </a:graphic>
+          </wp:inline>
+        </w:drawing>
+      </w:r>
+    </w:p>
+    <w:p>
+      <w:r>
+        <w:drawing>
+          <wp:inline distT="0" distB="0" distL="0" distR="0" wp14:anchorId="31907D1D" wp14:editId="0F1CA066">
+            <wp:extent cx="3010161" cy="1470787"/>
+            <wp:effectExtent l="0" t="0" r="0" b="0"/>
+            <wp:docPr id="702189790" name="Picture 1"/>
+            <wp:cNvGraphicFramePr>
+              <a:graphicFrameLocks xmlns:a="http://schemas.openxmlformats.org/drawingml/2006/main" noChangeAspect="1"/>
+            </wp:cNvGraphicFramePr>
+            <a:graphic xmlns:a="http://schemas.openxmlformats.org/drawingml/2006/main">
+              <a:graphicData uri="http://schemas.openxmlformats.org/drawingml/2006/picture">
+                <pic:pic xmlns:pic="http://schemas.openxmlformats.org/drawingml/2006/picture">
+                  <pic:nvPicPr>
+                    <pic:cNvPr id="702189790" name=""/>
+                    <pic:cNvPicPr/>
+                  </pic:nvPicPr>
+                  <pic:blipFill>
+                    <a:blip r:embed="rId14"/>
+                    <a:stretch>
+                      <a:fillRect/>
+                    </a:stretch>
+                  </pic:blipFill>
+                  <pic:spPr>
+                    <a:xfrm>
+                      <a:off x="0" y="0"/>
+                      <a:ext cx="3010161" cy="1470787"/>
+                    </a:xfrm>
+                    <a:prstGeom prst="rect">
+                      <a:avLst/>
+                    </a:prstGeom>
+                  </pic:spPr>
+                </pic:pic>
+              </a:graphicData>
+            </a:graphic>
+          </wp:inline>
+        </w:drawing>
+      </w:r>
+    </w:p>
+    <w:p>
+      <w:r>
+        <w:drawing>
+          <wp:inline distT="0" distB="0" distL="0" distR="0" wp14:anchorId="2B40F3D4" wp14:editId="4EDE9415">
+            <wp:extent cx="5731510" cy="2364740"/>
+            <wp:effectExtent l="0" t="0" r="2540" b="0"/>
+            <wp:docPr id="1058337415" name="Picture 1"/>
+            <wp:cNvGraphicFramePr>
+              <a:graphicFrameLocks xmlns:a="http://schemas.openxmlformats.org/drawingml/2006/main" noChangeAspect="1"/>
+            </wp:cNvGraphicFramePr>
+            <a:graphic xmlns:a="http://schemas.openxmlformats.org/drawingml/2006/main">
+              <a:graphicData uri="http://schemas.openxmlformats.org/drawingml/2006/picture">
+                <pic:pic xmlns:pic="http://schemas.openxmlformats.org/drawingml/2006/picture">
+                  <pic:nvPicPr>
+                    <pic:cNvPr id="1058337415" name=""/>
+                    <pic:cNvPicPr/>
+                  </pic:nvPicPr>
+                  <pic:blipFill>
+                    <a:blip r:embed="rId15"/>
+                    <a:stretch>
+                      <a:fillRect/>
+                    </a:stretch>
+                  </pic:blipFill>
+                  <pic:spPr>
+                    <a:xfrm>
+                      <a:off x="0" y="0"/>
+                      <a:ext cx="5731510" cy="2364740"/>
+                    </a:xfrm>
+                    <a:prstGeom prst="rect">
+                      <a:avLst/>
+                    </a:prstGeom>
+                  </pic:spPr>
+                </pic:pic>
+              </a:graphicData>
+            </a:graphic>
+          </wp:inline>
+        </w:drawing>
+      </w:r>
+    </w:p>
+    <w:p>
+      <w:r>
+        <w:lastRenderedPageBreak/>
+        <w:drawing>
+          <wp:inline distT="0" distB="0" distL="0" distR="0" wp14:anchorId="39A0B4A0" wp14:editId="653E4021">
+            <wp:extent cx="5281118" cy="2072820"/>
+            <wp:effectExtent l="0" t="0" r="0" b="3810"/>
+            <wp:docPr id="1816372738" name="Picture 1"/>
+            <wp:cNvGraphicFramePr>
+              <a:graphicFrameLocks xmlns:a="http://schemas.openxmlformats.org/drawingml/2006/main" noChangeAspect="1"/>
+            </wp:cNvGraphicFramePr>
+            <a:graphic xmlns:a="http://schemas.openxmlformats.org/drawingml/2006/main">
+              <a:graphicData uri="http://schemas.openxmlformats.org/drawingml/2006/picture">
+                <pic:pic xmlns:pic="http://schemas.openxmlformats.org/drawingml/2006/picture">
+                  <pic:nvPicPr>
+                    <pic:cNvPr id="1816372738" name=""/>
+                    <pic:cNvPicPr/>
+                  </pic:nvPicPr>
+                  <pic:blipFill>
+                    <a:blip r:embed="rId16"/>
+                    <a:stretch>
+                      <a:fillRect/>
+                    </a:stretch>
+                  </pic:blipFill>
+                  <pic:spPr>
+                    <a:xfrm>
+                      <a:off x="0" y="0"/>
+                      <a:ext cx="5281118" cy="2072820"/>
                     </a:xfrm>
                     <a:prstGeom prst="rect">
                       <a:avLst/>

</xml_diff>